<commit_message>
Docs: same references as the repository, clearer figures
</commit_message>
<xml_diff>
--- a/docs/Documentacao_Tecnica_VHDL_ABNT.docx
+++ b/docs/Documentacao_Tecnica_VHDL_ABNT.docx
@@ -159,6 +159,21 @@
           <w:szCs w:val="24"/>
         </w:rPr>
         <w:t xml:space="preserve">Este documento registra a implementação em VHDL de um multiplicador para o formato numérico takum logarítmico, seu acoplamento ao codec oficial do formato e o respectivo ambiente de verificação. Destina-se a registro técnico do que foi produzido, permitindo a terceiros reproduzir os resultados e dar continuidade ao trabalho.</w:t>
+      </w:r>
+    </w:p>
+    <w:p>
+      <w:pPr>
+        <w:spacing w:after="0" w:line="360"/>
+        <w:ind w:firstLine="708"/>
+        <w:jc w:val="both"/>
+      </w:pPr>
+      <w:r>
+        <w:rPr>
+          <w:rFonts w:ascii="Times New Roman" w:cs="Times New Roman" w:eastAsia="Times New Roman" w:hAnsi="Times New Roman"/>
+          <w:sz w:val="24"/>
+          <w:szCs w:val="24"/>
+        </w:rPr>
+        <w:t xml:space="preserve">O formato takum foi proposto por Hunhold (2024) como alternativa ao padrão IEEE 754 (INSTITUTE OF ELECTRICAL AND ELECTRONICS ENGINEERS, 2019) e aos posits (GUSTAFSON; YONEMOTO, 2017). Este trabalho emprega o codec oficial do formato, descrito em Hunhold (2025a) e disponibilizado em Hunhold (2025c). Avaliações do formato em aplicações numéricas e em extensões de conjunto de instruções encontram-se em Hunhold e Quinlan (2025), Hunhold e Gustafson (2025) e Hunhold (2025b).</w:t>
       </w:r>
     </w:p>
     <w:p>
@@ -1569,7 +1584,7 @@
           <w:sz w:val="20"/>
           <w:szCs w:val="20"/>
         </w:rPr>
-        <w:t xml:space="preserve">Fonte: elaborado pela autora, a partir de Hunhold (2025).</w:t>
+        <w:t xml:space="preserve">Fonte: elaborado pela autora, a partir de Hunhold (2025a).</w:t>
       </w:r>
     </w:p>
     <w:p>
@@ -10067,7 +10082,7 @@
           <w:sz w:val="24"/>
           <w:szCs w:val="24"/>
         </w:rPr>
-        <w:t xml:space="preserve">A Figura 2 reproduz o resumo da implementação do multiplicador isolado em sessenta e quatro bits, que cumpre a restrição com folga de 1,301 ns e não apresenta violações de regras de projeto.</w:t>
+        <w:t xml:space="preserve">A Figura 2 reproduz a tela de resumo do Vivado após a última das oito execuções, a do multiplicador isolado em sessenta e quatro bits, que cumpre a restrição com folga de 1,301 ns e não apresenta violações de regras de projeto. Os valores da tela, 118 LUTs, 213 registradores e 140 pontos de chegada de caminhos temporizados, coincidem com os da linha correspondente do Quadro 8.</w:t>
       </w:r>
     </w:p>
     <w:p>
@@ -10154,7 +10169,7 @@
           <w:sz w:val="24"/>
           <w:szCs w:val="24"/>
         </w:rPr>
-        <w:t xml:space="preserve">A Figura 3 mostra o posicionamento no dispositivo. A cadeia completa de dezesseis bits ocupa cerca de 80 slices, e o multiplicador isolado de sessenta e quatro bits, cerca de 60, dispostos em uma coluna estreita que acompanha a cadeia de transporte do somador; o dispositivo dispõe de 15.850 slices.</w:t>
+        <w:t xml:space="preserve">A Figura 3 mostra, para a mesma execução, o posicionamento do circuito no dispositivo: o multiplicador isolado de sessenta e quatro bits ocupa cerca de 60 das 15.850 slices disponíveis, dispostas em uma coluna estreita que acompanha a cadeia de transporte do somador.</w:t>
       </w:r>
     </w:p>
     <w:p>
@@ -10169,7 +10184,7 @@
           <w:sz w:val="20"/>
           <w:szCs w:val="20"/>
         </w:rPr>
-        <w:t xml:space="preserve">Figura 3 – Posicionamento no dispositivo: à esquerda, a cadeia completa com N = 16; à direita, o multiplicador isolado com N = 64</w:t>
+        <w:t xml:space="preserve">Figura 3 – Posicionamento do multiplicador isolado no dispositivo, N = 64</w:t>
       </w:r>
     </w:p>
     <w:p>
@@ -10181,8 +10196,8 @@
       <w:r>
         <w:drawing>
           <wp:inline distT="0" distB="0" distL="0" distR="0">
-            <wp:extent cx="4989067" cy="3600000"/>
-            <wp:docPr id="203" name="Figura 203"/>
+            <wp:extent cx="2073183" cy="3240000"/>
+            <wp:docPr id="301" name="Figura 301"/>
             <wp:cNvGraphicFramePr>
               <a:graphicFrameLocks xmlns:a="http://schemas.openxmlformats.org/drawingml/2006/main" noChangeAspect="1"/>
             </wp:cNvGraphicFramePr>
@@ -10190,11 +10205,11 @@
               <a:graphicData uri="http://schemas.openxmlformats.org/drawingml/2006/picture">
                 <pic:pic xmlns:pic="http://schemas.openxmlformats.org/drawingml/2006/picture">
                   <pic:nvPicPr>
-                    <pic:cNvPr id="203" name="figura203.png"/>
+                    <pic:cNvPr id="301" name="figura301.png"/>
                     <pic:cNvPicPr/>
                   </pic:nvPicPr>
                   <pic:blipFill>
-                    <a:blip r:embed="rIdFig203"/>
+                    <a:blip r:embed="rIdFig301"/>
                     <a:stretch>
                       <a:fillRect/>
                     </a:stretch>
@@ -10202,7 +10217,7 @@
                   <pic:spPr>
                     <a:xfrm>
                       <a:off x="0" y="0"/>
-                      <a:ext cx="4989067" cy="3600000"/>
+                      <a:ext cx="2073183" cy="3240000"/>
                     </a:xfrm>
                     <a:prstGeom prst="rect">
                       <a:avLst/>
@@ -12108,7 +12123,7 @@
           <w:sz w:val="24"/>
           <w:szCs w:val="24"/>
         </w:rPr>
-        <w:t xml:space="preserve">A primeira é comparar os resultados de síntese com multiplicadores de posit de mesma largura, medidos sob as mesmas restrições e com o mesmo invólucro, e avaliar uma versão da cadeia com estágios de registradores.</w:t>
+        <w:t xml:space="preserve">A primeira é comparar os resultados de síntese com multiplicadores de posit de mesma largura, medidos sob as mesmas restrições e com o mesmo invólucro, tomando como referência os geradores FloPoCo (MURILLO et al., 2020) e PACoGen (JAISWAL; SO, 2019) e as avaliações de custo de hardware de Uguen, Forget e Dinechin (2019) e de Murillo et al. (2022); codificações logarítmicas de posits, próximas da abordagem deste trabalho, são discutidas por Ramachandran et al. (2024). Avalia-se também uma versão da cadeia com estágios de registradores.</w:t>
       </w:r>
     </w:p>
     <w:p>
@@ -12188,7 +12203,25 @@
           <w:sz w:val="24"/>
           <w:szCs w:val="24"/>
         </w:rPr>
-        <w:t xml:space="preserve">HUNHOLD, Laslo. Beating posits at their own game: takum arithmetic. In: NEXT GENERATION ARITHMETIC: 5th International Conference, CoNGA 2024, 2024, Sydney. Proceedings [...]. Cham: Springer Nature Switzerland, 2024. (Lecture Notes in Computer Science, v. 14666).</w:t>
+        <w:t xml:space="preserve">GUSTAFSON, John L.; YONEMOTO, Isaac. Beating floating point at its own game: posit arithmetic. </w:t>
+      </w:r>
+      <w:r>
+        <w:rPr>
+          <w:rFonts w:ascii="Times New Roman" w:cs="Times New Roman" w:eastAsia="Times New Roman" w:hAnsi="Times New Roman"/>
+          <w:b/>
+          <w:bCs/>
+          <w:sz w:val="24"/>
+          <w:szCs w:val="24"/>
+        </w:rPr>
+        <w:t xml:space="preserve">Supercomputing Frontiers and Innovations</w:t>
+      </w:r>
+      <w:r>
+        <w:rPr>
+          <w:rFonts w:ascii="Times New Roman" w:cs="Times New Roman" w:eastAsia="Times New Roman" w:hAnsi="Times New Roman"/>
+          <w:sz w:val="24"/>
+          <w:szCs w:val="24"/>
+        </w:rPr>
+        <w:t xml:space="preserve">, v. 4, n. 2, p. 71-86, 2017. DOI: 10.14529/jsfi170206.</w:t>
       </w:r>
     </w:p>
     <w:p>
@@ -12202,7 +12235,25 @@
           <w:sz w:val="24"/>
           <w:szCs w:val="24"/>
         </w:rPr>
-        <w:t xml:space="preserve">HUNHOLD, Laslo. Design and implementation of a takum arithmetic hardware codec in VHDL. arXiv:2408.10594, 2025.</w:t>
+        <w:t xml:space="preserve">HUNHOLD, Laslo. Beating posits at their own game: takum arithmetic. In: NEXT GENERATION ARITHMETIC: INTERNATIONAL CONFERENCE, CoNGA, 5., 2024, Sydney. </w:t>
+      </w:r>
+      <w:r>
+        <w:rPr>
+          <w:rFonts w:ascii="Times New Roman" w:cs="Times New Roman" w:eastAsia="Times New Roman" w:hAnsi="Times New Roman"/>
+          <w:b/>
+          <w:bCs/>
+          <w:sz w:val="24"/>
+          <w:szCs w:val="24"/>
+        </w:rPr>
+        <w:t xml:space="preserve">Proceedings</w:t>
+      </w:r>
+      <w:r>
+        <w:rPr>
+          <w:rFonts w:ascii="Times New Roman" w:cs="Times New Roman" w:eastAsia="Times New Roman" w:hAnsi="Times New Roman"/>
+          <w:sz w:val="24"/>
+          <w:szCs w:val="24"/>
+        </w:rPr>
+        <w:t xml:space="preserve"> [...]. Cham: Springer Nature Switzerland, 2024. (Lecture Notes in Computer Science, v. 14666). DOI: 10.1007/978-3-031-72709-2_1.</w:t>
       </w:r>
     </w:p>
     <w:p>
@@ -12216,7 +12267,345 @@
           <w:sz w:val="24"/>
           <w:szCs w:val="24"/>
         </w:rPr>
-        <w:t xml:space="preserve">HUNHOLD, Laslo. Takum Codec RTL. Versão v1.1.0, 2025. Disponível em: https://github.com/takum-arithmetic/Takum-Codec-RTL. Acesso em: 5 out. 2026.</w:t>
+        <w:t xml:space="preserve">HUNHOLD, Laslo. </w:t>
+      </w:r>
+      <w:r>
+        <w:rPr>
+          <w:rFonts w:ascii="Times New Roman" w:cs="Times New Roman" w:eastAsia="Times New Roman" w:hAnsi="Times New Roman"/>
+          <w:b/>
+          <w:bCs/>
+          <w:sz w:val="24"/>
+          <w:szCs w:val="24"/>
+        </w:rPr>
+        <w:t xml:space="preserve">Design and implementation of a takum arithmetic hardware codec in VHDL</w:t>
+      </w:r>
+      <w:r>
+        <w:rPr>
+          <w:rFonts w:ascii="Times New Roman" w:cs="Times New Roman" w:eastAsia="Times New Roman" w:hAnsi="Times New Roman"/>
+          <w:sz w:val="24"/>
+          <w:szCs w:val="24"/>
+        </w:rPr>
+        <w:t xml:space="preserve">. arXiv:2408.10594, 2025a. Disponível em: https://arxiv.org/abs/2408.10594. Acesso em: 15 out. 2026.</w:t>
+      </w:r>
+    </w:p>
+    <w:p>
+      <w:pPr>
+        <w:spacing w:after="240" w:line="240"/>
+        <w:jc w:val="left"/>
+      </w:pPr>
+      <w:r>
+        <w:rPr>
+          <w:rFonts w:ascii="Times New Roman" w:cs="Times New Roman" w:eastAsia="Times New Roman" w:hAnsi="Times New Roman"/>
+          <w:sz w:val="24"/>
+          <w:szCs w:val="24"/>
+        </w:rPr>
+        <w:t xml:space="preserve">HUNHOLD, Laslo. </w:t>
+      </w:r>
+      <w:r>
+        <w:rPr>
+          <w:rFonts w:ascii="Times New Roman" w:cs="Times New Roman" w:eastAsia="Times New Roman" w:hAnsi="Times New Roman"/>
+          <w:b/>
+          <w:bCs/>
+          <w:sz w:val="24"/>
+          <w:szCs w:val="24"/>
+        </w:rPr>
+        <w:t xml:space="preserve">Streamlining SIMD ISA extensions with takum arithmetic</w:t>
+      </w:r>
+      <w:r>
+        <w:rPr>
+          <w:rFonts w:ascii="Times New Roman" w:cs="Times New Roman" w:eastAsia="Times New Roman" w:hAnsi="Times New Roman"/>
+          <w:sz w:val="24"/>
+          <w:szCs w:val="24"/>
+        </w:rPr>
+        <w:t xml:space="preserve">: a case study on Intel AVX10.2. arXiv:2503.14067, 2025b. Disponível em: https://arxiv.org/abs/2503.14067. Acesso em: 15 out. 2026.</w:t>
+      </w:r>
+    </w:p>
+    <w:p>
+      <w:pPr>
+        <w:spacing w:after="240" w:line="240"/>
+        <w:jc w:val="left"/>
+      </w:pPr>
+      <w:r>
+        <w:rPr>
+          <w:rFonts w:ascii="Times New Roman" w:cs="Times New Roman" w:eastAsia="Times New Roman" w:hAnsi="Times New Roman"/>
+          <w:sz w:val="24"/>
+          <w:szCs w:val="24"/>
+        </w:rPr>
+        <w:t xml:space="preserve">HUNHOLD, Laslo. </w:t>
+      </w:r>
+      <w:r>
+        <w:rPr>
+          <w:rFonts w:ascii="Times New Roman" w:cs="Times New Roman" w:eastAsia="Times New Roman" w:hAnsi="Times New Roman"/>
+          <w:b/>
+          <w:bCs/>
+          <w:sz w:val="24"/>
+          <w:szCs w:val="24"/>
+        </w:rPr>
+        <w:t xml:space="preserve">Takum Codec RTL</w:t>
+      </w:r>
+      <w:r>
+        <w:rPr>
+          <w:rFonts w:ascii="Times New Roman" w:cs="Times New Roman" w:eastAsia="Times New Roman" w:hAnsi="Times New Roman"/>
+          <w:sz w:val="24"/>
+          <w:szCs w:val="24"/>
+        </w:rPr>
+        <w:t xml:space="preserve">. Versão v1.1.0. 2025c. DOI: 10.5281/zenodo.16923066. Disponível em: https://github.com/takum-arithmetic/Takum-Codec-RTL. Acesso em: 5 out. 2026.</w:t>
+      </w:r>
+    </w:p>
+    <w:p>
+      <w:pPr>
+        <w:spacing w:after="240" w:line="240"/>
+        <w:jc w:val="left"/>
+      </w:pPr>
+      <w:r>
+        <w:rPr>
+          <w:rFonts w:ascii="Times New Roman" w:cs="Times New Roman" w:eastAsia="Times New Roman" w:hAnsi="Times New Roman"/>
+          <w:sz w:val="24"/>
+          <w:szCs w:val="24"/>
+        </w:rPr>
+        <w:t xml:space="preserve">HUNHOLD, Laslo; GUSTAFSON, John. Spectral methods via FFTs in emerging machine number formats: OFP8, bfloat16, posit, and takum arithmetics. In: INTERNATIONAL CONFERENCE FOR HIGH PERFORMANCE COMPUTING, NETWORKING, STORAGE AND ANALYSIS, SC '25, 2025. </w:t>
+      </w:r>
+      <w:r>
+        <w:rPr>
+          <w:rFonts w:ascii="Times New Roman" w:cs="Times New Roman" w:eastAsia="Times New Roman" w:hAnsi="Times New Roman"/>
+          <w:b/>
+          <w:bCs/>
+          <w:sz w:val="24"/>
+          <w:szCs w:val="24"/>
+        </w:rPr>
+        <w:t xml:space="preserve">Proceedings</w:t>
+      </w:r>
+      <w:r>
+        <w:rPr>
+          <w:rFonts w:ascii="Times New Roman" w:cs="Times New Roman" w:eastAsia="Times New Roman" w:hAnsi="Times New Roman"/>
+          <w:sz w:val="24"/>
+          <w:szCs w:val="24"/>
+        </w:rPr>
+        <w:t xml:space="preserve"> [...]. 2025. arXiv:2504.21197.</w:t>
+      </w:r>
+    </w:p>
+    <w:p>
+      <w:pPr>
+        <w:spacing w:after="240" w:line="240"/>
+        <w:jc w:val="left"/>
+      </w:pPr>
+      <w:r>
+        <w:rPr>
+          <w:rFonts w:ascii="Times New Roman" w:cs="Times New Roman" w:eastAsia="Times New Roman" w:hAnsi="Times New Roman"/>
+          <w:sz w:val="24"/>
+          <w:szCs w:val="24"/>
+        </w:rPr>
+        <w:t xml:space="preserve">HUNHOLD, Laslo; QUINLAN, James. Evaluation of bfloat16, posit, and takum arithmetics in sparse linear solvers. In: IEEE SYMPOSIUM ON COMPUTER ARITHMETIC, ARITH, 32., 2025. </w:t>
+      </w:r>
+      <w:r>
+        <w:rPr>
+          <w:rFonts w:ascii="Times New Roman" w:cs="Times New Roman" w:eastAsia="Times New Roman" w:hAnsi="Times New Roman"/>
+          <w:b/>
+          <w:bCs/>
+          <w:sz w:val="24"/>
+          <w:szCs w:val="24"/>
+        </w:rPr>
+        <w:t xml:space="preserve">Proceedings</w:t>
+      </w:r>
+      <w:r>
+        <w:rPr>
+          <w:rFonts w:ascii="Times New Roman" w:cs="Times New Roman" w:eastAsia="Times New Roman" w:hAnsi="Times New Roman"/>
+          <w:sz w:val="24"/>
+          <w:szCs w:val="24"/>
+        </w:rPr>
+        <w:t xml:space="preserve"> [...]. IEEE, 2025. DOI: 10.1109/ARITH64983.2025.00019.</w:t>
+      </w:r>
+    </w:p>
+    <w:p>
+      <w:pPr>
+        <w:spacing w:after="240" w:line="240"/>
+        <w:jc w:val="left"/>
+      </w:pPr>
+      <w:r>
+        <w:rPr>
+          <w:rFonts w:ascii="Times New Roman" w:cs="Times New Roman" w:eastAsia="Times New Roman" w:hAnsi="Times New Roman"/>
+          <w:sz w:val="24"/>
+          <w:szCs w:val="24"/>
+        </w:rPr>
+        <w:t xml:space="preserve">INSTITUTE OF ELECTRICAL AND ELECTRONICS ENGINEERS. </w:t>
+      </w:r>
+      <w:r>
+        <w:rPr>
+          <w:rFonts w:ascii="Times New Roman" w:cs="Times New Roman" w:eastAsia="Times New Roman" w:hAnsi="Times New Roman"/>
+          <w:b/>
+          <w:bCs/>
+          <w:sz w:val="24"/>
+          <w:szCs w:val="24"/>
+        </w:rPr>
+        <w:t xml:space="preserve">IEEE 754-2019</w:t>
+      </w:r>
+      <w:r>
+        <w:rPr>
+          <w:rFonts w:ascii="Times New Roman" w:cs="Times New Roman" w:eastAsia="Times New Roman" w:hAnsi="Times New Roman"/>
+          <w:sz w:val="24"/>
+          <w:szCs w:val="24"/>
+        </w:rPr>
+        <w:t xml:space="preserve">: IEEE standard for floating-point arithmetic. New York: IEEE, 2019. DOI: 10.1109/IEEESTD.2019.8766229.</w:t>
+      </w:r>
+    </w:p>
+    <w:p>
+      <w:pPr>
+        <w:spacing w:after="240" w:line="240"/>
+        <w:jc w:val="left"/>
+      </w:pPr>
+      <w:r>
+        <w:rPr>
+          <w:rFonts w:ascii="Times New Roman" w:cs="Times New Roman" w:eastAsia="Times New Roman" w:hAnsi="Times New Roman"/>
+          <w:sz w:val="24"/>
+          <w:szCs w:val="24"/>
+        </w:rPr>
+        <w:t xml:space="preserve">JAISWAL, Manish Kumar; SO, Hayden K.-H. PACoGen: a hardware posit arithmetic core generator. </w:t>
+      </w:r>
+      <w:r>
+        <w:rPr>
+          <w:rFonts w:ascii="Times New Roman" w:cs="Times New Roman" w:eastAsia="Times New Roman" w:hAnsi="Times New Roman"/>
+          <w:b/>
+          <w:bCs/>
+          <w:sz w:val="24"/>
+          <w:szCs w:val="24"/>
+        </w:rPr>
+        <w:t xml:space="preserve">IEEE Access</w:t>
+      </w:r>
+      <w:r>
+        <w:rPr>
+          <w:rFonts w:ascii="Times New Roman" w:cs="Times New Roman" w:eastAsia="Times New Roman" w:hAnsi="Times New Roman"/>
+          <w:sz w:val="24"/>
+          <w:szCs w:val="24"/>
+        </w:rPr>
+        <w:t xml:space="preserve">, v. 7, p. 74586-74601, 2019. DOI: 10.1109/ACCESS.2019.2920936.</w:t>
+      </w:r>
+    </w:p>
+    <w:p>
+      <w:pPr>
+        <w:spacing w:after="240" w:line="240"/>
+        <w:jc w:val="left"/>
+      </w:pPr>
+      <w:r>
+        <w:rPr>
+          <w:rFonts w:ascii="Times New Roman" w:cs="Times New Roman" w:eastAsia="Times New Roman" w:hAnsi="Times New Roman"/>
+          <w:sz w:val="24"/>
+          <w:szCs w:val="24"/>
+        </w:rPr>
+        <w:t xml:space="preserve">MURILLO, Raul et al. Customized posit adders and multipliers using the FloPoCo core generator. In: IEEE INTERNATIONAL SYMPOSIUM ON CIRCUITS AND SYSTEMS, ISCAS, 2020. </w:t>
+      </w:r>
+      <w:r>
+        <w:rPr>
+          <w:rFonts w:ascii="Times New Roman" w:cs="Times New Roman" w:eastAsia="Times New Roman" w:hAnsi="Times New Roman"/>
+          <w:b/>
+          <w:bCs/>
+          <w:sz w:val="24"/>
+          <w:szCs w:val="24"/>
+        </w:rPr>
+        <w:t xml:space="preserve">Proceedings</w:t>
+      </w:r>
+      <w:r>
+        <w:rPr>
+          <w:rFonts w:ascii="Times New Roman" w:cs="Times New Roman" w:eastAsia="Times New Roman" w:hAnsi="Times New Roman"/>
+          <w:sz w:val="24"/>
+          <w:szCs w:val="24"/>
+        </w:rPr>
+        <w:t xml:space="preserve"> [...]. IEEE, 2020. p. 1-5. DOI: 10.1109/ISCAS45731.2020.9180771.</w:t>
+      </w:r>
+    </w:p>
+    <w:p>
+      <w:pPr>
+        <w:spacing w:after="240" w:line="240"/>
+        <w:jc w:val="left"/>
+      </w:pPr>
+      <w:r>
+        <w:rPr>
+          <w:rFonts w:ascii="Times New Roman" w:cs="Times New Roman" w:eastAsia="Times New Roman" w:hAnsi="Times New Roman"/>
+          <w:sz w:val="24"/>
+          <w:szCs w:val="24"/>
+        </w:rPr>
+        <w:t xml:space="preserve">MURILLO, Raul et al. Comparing different decodings for posit arithmetic. In: CONFERENCE ON NEXT GENERATION ARITHMETIC, CoNGA, 2022. </w:t>
+      </w:r>
+      <w:r>
+        <w:rPr>
+          <w:rFonts w:ascii="Times New Roman" w:cs="Times New Roman" w:eastAsia="Times New Roman" w:hAnsi="Times New Roman"/>
+          <w:b/>
+          <w:bCs/>
+          <w:sz w:val="24"/>
+          <w:szCs w:val="24"/>
+        </w:rPr>
+        <w:t xml:space="preserve">Proceedings</w:t>
+      </w:r>
+      <w:r>
+        <w:rPr>
+          <w:rFonts w:ascii="Times New Roman" w:cs="Times New Roman" w:eastAsia="Times New Roman" w:hAnsi="Times New Roman"/>
+          <w:sz w:val="24"/>
+          <w:szCs w:val="24"/>
+        </w:rPr>
+        <w:t xml:space="preserve"> [...]. Cham: Springer, 2022. p. 84-99. DOI: 10.1007/978-3-031-09779-9_6.</w:t>
+      </w:r>
+    </w:p>
+    <w:p>
+      <w:pPr>
+        <w:spacing w:after="240" w:line="240"/>
+        <w:jc w:val="left"/>
+      </w:pPr>
+      <w:r>
+        <w:rPr>
+          <w:rFonts w:ascii="Times New Roman" w:cs="Times New Roman" w:eastAsia="Times New Roman" w:hAnsi="Times New Roman"/>
+          <w:sz w:val="24"/>
+          <w:szCs w:val="24"/>
+        </w:rPr>
+        <w:t xml:space="preserve">RAMACHANDRAN, Akshat et al. </w:t>
+      </w:r>
+      <w:r>
+        <w:rPr>
+          <w:rFonts w:ascii="Times New Roman" w:cs="Times New Roman" w:eastAsia="Times New Roman" w:hAnsi="Times New Roman"/>
+          <w:b/>
+          <w:bCs/>
+          <w:sz w:val="24"/>
+          <w:szCs w:val="24"/>
+        </w:rPr>
+        <w:t xml:space="preserve">Algorithm-hardware co-design of distribution-aware logarithmic-posit encodings for efficient DNN inference</w:t>
+      </w:r>
+      <w:r>
+        <w:rPr>
+          <w:rFonts w:ascii="Times New Roman" w:cs="Times New Roman" w:eastAsia="Times New Roman" w:hAnsi="Times New Roman"/>
+          <w:sz w:val="24"/>
+          <w:szCs w:val="24"/>
+        </w:rPr>
+        <w:t xml:space="preserve">. arXiv:2403.05465, 2024. Disponível em: https://arxiv.org/abs/2403.05465. Acesso em: 15 out. 2026.</w:t>
+      </w:r>
+    </w:p>
+    <w:p>
+      <w:pPr>
+        <w:spacing w:after="240" w:line="240"/>
+        <w:jc w:val="left"/>
+      </w:pPr>
+      <w:r>
+        <w:rPr>
+          <w:rFonts w:ascii="Times New Roman" w:cs="Times New Roman" w:eastAsia="Times New Roman" w:hAnsi="Times New Roman"/>
+          <w:sz w:val="24"/>
+          <w:szCs w:val="24"/>
+        </w:rPr>
+        <w:t xml:space="preserve">UGUEN, Yohann; FORGET, Luc; DINECHIN, Florent de. Evaluating the hardware cost of the posit number system. In: INTERNATIONAL CONFERENCE ON FIELD PROGRAMMABLE LOGIC AND APPLICATIONS, FPL, 29., 2019. </w:t>
+      </w:r>
+      <w:r>
+        <w:rPr>
+          <w:rFonts w:ascii="Times New Roman" w:cs="Times New Roman" w:eastAsia="Times New Roman" w:hAnsi="Times New Roman"/>
+          <w:b/>
+          <w:bCs/>
+          <w:sz w:val="24"/>
+          <w:szCs w:val="24"/>
+        </w:rPr>
+        <w:t xml:space="preserve">Proceedings</w:t>
+      </w:r>
+      <w:r>
+        <w:rPr>
+          <w:rFonts w:ascii="Times New Roman" w:cs="Times New Roman" w:eastAsia="Times New Roman" w:hAnsi="Times New Roman"/>
+          <w:sz w:val="24"/>
+          <w:szCs w:val="24"/>
+        </w:rPr>
+        <w:t xml:space="preserve"> [...]. IEEE, 2019. p. 106-113. DOI: 10.1109/FPL.2019.00026.</w:t>
       </w:r>
     </w:p>
     <w:sectPr>

</xml_diff>